<commit_message>
Alarga a coluna de Endereço no quadro do Aditivo EV PJ→PJ
Redistribui 600 twips (~0.42in) da última coluna do quadro — compartilhada
pelas células de "Complemento" e "Celular", que só guardam textos curtos —
para a coluna que compõe o valor de "Endereço", que recebe o texto mais
longo na prática (endereço completo). A largura total de cada tabela
permanece exatamente a mesma; só a distribuição entre colunas muda.

Testado renderizando o template com endereços/nomes propositalmente muito
longos (via docxtemplater + conferência do HTML gerado, já que este ambiente
não tem um Word/LibreOffice funcional para preview visual) — a estrutura de
16 colunas permanece íntegra em ambos os quadros.

Mesma observação do commit anterior: só entra em vigor após reimportar o
template (POST /api/admin/seed-templates?force=true, ou reenviando o .docx
pela aba Templates).
</commit_message>
<xml_diff>
--- a/_template-source/aditivo_ev_pj_para_pj.docx
+++ b/_template-source/aditivo_ev_pj_para_pj.docx
@@ -322,7 +322,7 @@
         <w:gridCol w:w="480"/>
         <w:gridCol w:w="105"/>
         <w:gridCol w:w="300"/>
-        <w:gridCol w:w="1200"/>
+        <w:gridCol w:w="1800"/>
         <w:gridCol w:w="870"/>
         <w:gridCol w:w="330"/>
         <w:gridCol w:w="615"/>
@@ -333,14 +333,14 @@
         <w:gridCol w:w="1170"/>
         <w:gridCol w:w="285"/>
         <w:gridCol w:w="105"/>
-        <w:gridCol w:w="1740"/>
+        <w:gridCol w:w="1140"/>
         <w:tblGridChange w:id="0">
           <w:tblGrid>
             <w:gridCol w:w="1155"/>
             <w:gridCol w:w="480"/>
             <w:gridCol w:w="105"/>
             <w:gridCol w:w="300"/>
-            <w:gridCol w:w="1200"/>
+            <w:gridCol w:w="1800"/>
             <w:gridCol w:w="870"/>
             <w:gridCol w:w="330"/>
             <w:gridCol w:w="615"/>
@@ -351,7 +351,7 @@
             <w:gridCol w:w="1170"/>
             <w:gridCol w:w="285"/>
             <w:gridCol w:w="105"/>
-            <w:gridCol w:w="1740"/>
+            <w:gridCol w:w="1140"/>
           </w:tblGrid>
         </w:tblGridChange>
       </w:tblGrid>
@@ -2434,7 +2434,7 @@
         <w:gridCol w:w="285"/>
         <w:gridCol w:w="300"/>
         <w:gridCol w:w="300"/>
-        <w:gridCol w:w="1200"/>
+        <w:gridCol w:w="1800"/>
         <w:gridCol w:w="870"/>
         <w:gridCol w:w="330"/>
         <w:gridCol w:w="615"/>
@@ -2445,14 +2445,14 @@
         <w:gridCol w:w="975"/>
         <w:gridCol w:w="285"/>
         <w:gridCol w:w="105"/>
-        <w:gridCol w:w="1785"/>
+        <w:gridCol w:w="1185"/>
         <w:tblGridChange w:id="0">
           <w:tblGrid>
             <w:gridCol w:w="1155"/>
             <w:gridCol w:w="285"/>
             <w:gridCol w:w="300"/>
             <w:gridCol w:w="300"/>
-            <w:gridCol w:w="1200"/>
+            <w:gridCol w:w="1800"/>
             <w:gridCol w:w="870"/>
             <w:gridCol w:w="330"/>
             <w:gridCol w:w="615"/>
@@ -2463,7 +2463,7 @@
             <w:gridCol w:w="975"/>
             <w:gridCol w:w="285"/>
             <w:gridCol w:w="105"/>
-            <w:gridCol w:w="1785"/>
+            <w:gridCol w:w="1185"/>
           </w:tblGrid>
         </w:tblGridChange>
       </w:tblGrid>

</xml_diff>